<commit_message>
Last updated on 2026-08-10 14:36:59
</commit_message>
<xml_diff>
--- a/assets/resume-arghya.docx
+++ b/assets/resume-arghya.docx
@@ -1,6 +1,6 @@
 
 <file path=word/document.xml><?xml version="1.0" encoding="utf-8"?>
-<w:document xmlns:wpc="http://schemas.microsoft.com/office/word/2010/wordprocessingCanvas" xmlns:cx="http://schemas.microsoft.com/office/drawing/2014/chartex" xmlns:cx1="http://schemas.microsoft.com/office/drawing/2015/9/8/chartex" xmlns:cx2="http://schemas.microsoft.com/office/drawing/2015/10/21/chartex" xmlns:cx3="http://schemas.microsoft.com/office/drawing/2016/5/9/chartex" xmlns:cx4="http://schemas.microsoft.com/office/drawing/2016/5/10/chartex" xmlns:cx5="http://schemas.microsoft.com/office/drawing/2016/5/11/chartex" xmlns:cx6="http://schemas.microsoft.com/office/drawing/2016/5/12/chartex" xmlns:cx7="http://schemas.microsoft.com/office/drawing/2016/5/13/chartex" xmlns:cx8="http://schemas.microsoft.com/office/drawing/2016/5/14/chartex" xmlns:mc="http://schemas.openxmlformats.org/markup-compatibility/2006" xmlns:aink="http://schemas.microsoft.com/office/drawing/2016/ink" xmlns:am3d="http://schemas.microsoft.com/office/drawing/2017/model3d" xmlns:o="urn:schemas-microsoft-com:office:office" xmlns:oel="http://schemas.microsoft.com/office/2019/extlst" xmlns:r="http://schemas.openxmlformats.org/officeDocument/2006/relationships" xmlns:m="http://schemas.openxmlformats.org/officeDocument/2006/math" xmlns:v="urn:schemas-microsoft-com:vml" xmlns:wp14="http://schemas.microsoft.com/office/word/2010/wordprocessingDrawing" xmlns:wp="http://schemas.openxmlformats.org/drawingml/2006/wordprocessingDrawing" xmlns:w10="urn:schemas-microsoft-com:office:word" xmlns:w="http://schemas.openxmlformats.org/wordprocessingml/2006/main" xmlns:w14="http://schemas.microsoft.com/office/word/2010/wordml" xmlns:w15="http://schemas.microsoft.com/office/word/2012/wordml" xmlns:w16cex="http://schemas.microsoft.com/office/word/2018/wordml/cex" xmlns:w16cid="http://schemas.microsoft.com/office/word/2016/wordml/cid" xmlns:w16="http://schemas.microsoft.com/office/word/2018/wordml" xmlns:w16du="http://schemas.microsoft.com/office/word/2023/wordml/word16du" xmlns:w16sdtdh="http://schemas.microsoft.com/office/word/2020/wordml/sdtdatahash" xmlns:w16sdtfl="http://schemas.microsoft.com/office/word/2024/wordml/sdtformatlock" xmlns:w16se="http://schemas.microsoft.com/office/word/2015/wordml/symex" xmlns:wpg="http://schemas.microsoft.com/office/word/2010/wordprocessingGroup" xmlns:wpi="http://schemas.microsoft.com/office/word/2010/wordprocessingInk" xmlns:wne="http://schemas.microsoft.com/office/word/2006/wordml" xmlns:wps="http://schemas.microsoft.com/office/word/2010/wordprocessingShape" mc:Ignorable="w14 w15 w16se w16cid w16 w16cex w16sdtdh w16sdtfl w16du wp14">
+<w:document xmlns:wpc="http://schemas.microsoft.com/office/word/2010/wordprocessingCanvas" xmlns:cx="http://schemas.microsoft.com/office/drawing/2014/chartex" xmlns:cx1="http://schemas.microsoft.com/office/drawing/2015/9/8/chartex" xmlns:cx2="http://schemas.microsoft.com/office/drawing/2015/10/21/chartex" xmlns:cx3="http://schemas.microsoft.com/office/drawing/2016/5/9/chartex" xmlns:cx4="http://schemas.microsoft.com/office/drawing/2016/5/10/chartex" xmlns:cx5="http://schemas.microsoft.com/office/drawing/2016/5/11/chartex" xmlns:cx6="http://schemas.microsoft.com/office/drawing/2016/5/12/chartex" xmlns:cx7="http://schemas.microsoft.com/office/drawing/2016/5/13/chartex" xmlns:cx8="http://schemas.microsoft.com/office/drawing/2016/5/14/chartex" xmlns:mc="http://schemas.openxmlformats.org/markup-compatibility/2006" xmlns:m="http://schemas.openxmlformats.org/officeDocument/2006/math" xmlns:aink="http://schemas.microsoft.com/office/drawing/2016/ink" xmlns:am3d="http://schemas.microsoft.com/office/drawing/2017/model3d" xmlns:oel="http://schemas.microsoft.com/office/2019/extlst" xmlns:r="http://schemas.openxmlformats.org/officeDocument/2006/relationships" xmlns:wp14="http://schemas.microsoft.com/office/word/2010/wordprocessingDrawing" xmlns:wp="http://schemas.openxmlformats.org/drawingml/2006/wordprocessingDrawing" xmlns:wpg="http://schemas.microsoft.com/office/word/2010/wordprocessingGroup" xmlns:wpi="http://schemas.microsoft.com/office/word/2010/wordprocessingInk" xmlns:wps="http://schemas.microsoft.com/office/word/2010/wordprocessingShape" xmlns:o="urn:schemas-microsoft-com:office:office" xmlns:v="urn:schemas-microsoft-com:vml" xmlns:w10="urn:schemas-microsoft-com:office:word" xmlns:w="http://schemas.openxmlformats.org/wordprocessingml/2006/main" xmlns:w14="http://schemas.microsoft.com/office/word/2010/wordml" xmlns:w15="http://schemas.microsoft.com/office/word/2012/wordml" xmlns:w16cei="http://schemas.microsoft.com/office/word/2026/wordml/cei" xmlns:w16cex="http://schemas.microsoft.com/office/word/2018/wordml/cex" xmlns:w16cid="http://schemas.microsoft.com/office/word/2016/wordml/cid" xmlns:w16="http://schemas.microsoft.com/office/word/2018/wordml" xmlns:w16sdtdh="http://schemas.microsoft.com/office/word/2020/wordml/sdtdatahash" xmlns:w16sdtfl="http://schemas.microsoft.com/office/word/2024/wordml/sdtformatlock" xmlns:w16se="http://schemas.microsoft.com/office/word/2015/wordml/symex" xmlns:w16du="http://schemas.microsoft.com/office/word/2023/wordml/word16du" xmlns:wne="http://schemas.microsoft.com/office/word/2006/wordml" mc:Ignorable="w14 w15 w16se w16cid w16 w16cex w16sdtdh w16sdtfl w16du wp14">
   <w:body>
     <w:p>
       <w:pPr>
@@ -569,7 +569,7 @@
           <w:bCs/>
           <w:color w:val="000000" w:themeColor="text1"/>
         </w:rPr>
-        <w:t>Teaching</w:t>
+        <w:t>Courses taught</w:t>
       </w:r>
     </w:p>
     <w:p>
@@ -579,20 +579,20 @@
         </w:tabs>
         <w:rPr>
           <w:rFonts w:ascii="Optima" w:eastAsia="Microsoft GothicNeo" w:hAnsi="Optima" w:cs="CMU Sans Serif Medium"/>
-          <w:color w:val="000000" w:themeColor="text1"/>
-          <w:sz w:val="22"/>
-          <w:szCs w:val="22"/>
-        </w:rPr>
-      </w:pPr>
-      <w:r>
-        <w:rPr>
-          <w:rFonts w:ascii="Optima" w:eastAsia="Microsoft GothicNeo" w:hAnsi="Optima" w:cs="CMU Sans Serif Medium"/>
-          <w:color w:val="000000" w:themeColor="text1"/>
-          <w:sz w:val="22"/>
-          <w:szCs w:val="22"/>
-        </w:rPr>
-        <w:t>I’ve taught the following courses at SRM University, AP:</w:t>
-      </w:r>
+          <w:i/>
+          <w:iCs/>
+          <w:color w:val="000000" w:themeColor="text1"/>
+          <w:sz w:val="22"/>
+          <w:szCs w:val="22"/>
+        </w:rPr>
+        <w:sectPr>
+          <w:type w:val="continuous"/>
+          <w:pgSz w:w="11906" w:h="16838"/>
+          <w:pgMar w:top="1440" w:right="1080" w:bottom="1440" w:left="1080" w:header="708" w:footer="708" w:gutter="0"/>
+          <w:cols w:space="708"/>
+          <w:docGrid w:linePitch="360"/>
+        </w:sectPr>
+      </w:pPr>
     </w:p>
     <w:p>
       <w:pPr>
@@ -814,7 +814,7 @@
           <w:sz w:val="22"/>
           <w:szCs w:val="22"/>
         </w:rPr>
-        <w:t xml:space="preserve"> (Optional elective for B.Tech.)</w:t>
+        <w:t xml:space="preserve"> (B.Tech.)</w:t>
       </w:r>
     </w:p>
     <w:p>
@@ -832,12 +832,104 @@
       <w:r>
         <w:rPr>
           <w:rFonts w:ascii="Optima" w:eastAsia="Microsoft GothicNeo" w:hAnsi="Optima" w:cs="CMU Sans Serif Medium"/>
-          <w:color w:val="000000" w:themeColor="text1"/>
-          <w:sz w:val="22"/>
-          <w:szCs w:val="22"/>
-        </w:rPr>
-        <w:t>Introduction to Python and R (B.Sc. Physics)</w:t>
-      </w:r>
+          <w:i/>
+          <w:iCs/>
+          <w:color w:val="000000" w:themeColor="text1"/>
+          <w:sz w:val="22"/>
+          <w:szCs w:val="22"/>
+        </w:rPr>
+        <w:t>Introduction to Python and R</w:t>
+      </w:r>
+      <w:r>
+        <w:rPr>
+          <w:rFonts w:ascii="Optima" w:eastAsia="Microsoft GothicNeo" w:hAnsi="Optima" w:cs="CMU Sans Serif Medium"/>
+          <w:color w:val="000000" w:themeColor="text1"/>
+          <w:sz w:val="22"/>
+          <w:szCs w:val="22"/>
+        </w:rPr>
+        <w:t xml:space="preserve"> (B.Sc. Physics)</w:t>
+      </w:r>
+    </w:p>
+    <w:p>
+      <w:pPr>
+        <w:tabs>
+          <w:tab w:val="left" w:pos="2379"/>
+        </w:tabs>
+        <w:rPr>
+          <w:rFonts w:ascii="Optima" w:eastAsia="Microsoft GothicNeo" w:hAnsi="Optima" w:cs="CMU Sans Serif Medium"/>
+          <w:color w:val="000000" w:themeColor="text1"/>
+          <w:sz w:val="22"/>
+          <w:szCs w:val="22"/>
+        </w:rPr>
+      </w:pPr>
+      <w:r>
+        <w:rPr>
+          <w:rFonts w:ascii="Optima" w:eastAsia="Microsoft GothicNeo" w:hAnsi="Optima" w:cs="CMU Sans Serif Medium"/>
+          <w:i/>
+          <w:iCs/>
+          <w:color w:val="000000" w:themeColor="text1"/>
+          <w:sz w:val="22"/>
+          <w:szCs w:val="22"/>
+        </w:rPr>
+        <w:t>AI for Physical Systems</w:t>
+      </w:r>
+      <w:r>
+        <w:rPr>
+          <w:rFonts w:ascii="Optima" w:eastAsia="Microsoft GothicNeo" w:hAnsi="Optima" w:cs="CMU Sans Serif Medium"/>
+          <w:color w:val="000000" w:themeColor="text1"/>
+          <w:sz w:val="22"/>
+          <w:szCs w:val="22"/>
+        </w:rPr>
+        <w:t xml:space="preserve"> (M.Sc. Physics)</w:t>
+      </w:r>
+    </w:p>
+    <w:p>
+      <w:pPr>
+        <w:tabs>
+          <w:tab w:val="left" w:pos="2379"/>
+        </w:tabs>
+        <w:rPr>
+          <w:rFonts w:ascii="Optima" w:eastAsia="Microsoft GothicNeo" w:hAnsi="Optima" w:cs="CMU Sans Serif Medium"/>
+          <w:color w:val="000000" w:themeColor="text1"/>
+          <w:sz w:val="22"/>
+          <w:szCs w:val="22"/>
+        </w:rPr>
+      </w:pPr>
+      <w:r>
+        <w:rPr>
+          <w:rFonts w:ascii="Optima" w:eastAsia="Microsoft GothicNeo" w:hAnsi="Optima" w:cs="CMU Sans Serif Medium"/>
+          <w:i/>
+          <w:iCs/>
+          <w:color w:val="000000" w:themeColor="text1"/>
+          <w:sz w:val="22"/>
+          <w:szCs w:val="22"/>
+        </w:rPr>
+        <w:t>Data analysis and modeling</w:t>
+      </w:r>
+      <w:r>
+        <w:rPr>
+          <w:rFonts w:ascii="Optima" w:eastAsia="Microsoft GothicNeo" w:hAnsi="Optima" w:cs="CMU Sans Serif Medium"/>
+          <w:color w:val="000000" w:themeColor="text1"/>
+          <w:sz w:val="22"/>
+          <w:szCs w:val="22"/>
+        </w:rPr>
+        <w:t xml:space="preserve"> (M.Sc. university-wide course)</w:t>
+      </w:r>
+    </w:p>
+    <w:p>
+      <w:pPr>
+        <w:rPr>
+          <w:rFonts w:ascii="Optima" w:eastAsia="Microsoft GothicNeo" w:hAnsi="Optima" w:cs="CMU Sans Serif Medium"/>
+          <w:color w:val="000000" w:themeColor="text1"/>
+        </w:rPr>
+        <w:sectPr>
+          <w:type w:val="continuous"/>
+          <w:pgSz w:w="11906" w:h="16838"/>
+          <w:pgMar w:top="1440" w:right="1080" w:bottom="1440" w:left="1080" w:header="708" w:footer="708" w:gutter="0"/>
+          <w:cols w:num="2" w:space="708"/>
+          <w:docGrid w:linePitch="360"/>
+        </w:sectPr>
+      </w:pPr>
     </w:p>
     <w:p>
       <w:pPr>
@@ -1931,16 +2023,14 @@
           <w:sz w:val="22"/>
           <w:szCs w:val="22"/>
         </w:rPr>
-      </w:pPr>
-      <w:r>
-        <w:rPr>
-          <w:rFonts w:ascii="Optima" w:eastAsia="Microsoft GothicNeo" w:hAnsi="Optima" w:cs="CMU Sans Serif Medium"/>
-          <w:color w:val="000000" w:themeColor="text1"/>
-          <w:sz w:val="22"/>
-          <w:szCs w:val="22"/>
-        </w:rPr>
-        <w:t>Computational Biology and Chemistry</w:t>
-      </w:r>
+        <w:sectPr>
+          <w:type w:val="continuous"/>
+          <w:pgSz w:w="11906" w:h="16838"/>
+          <w:pgMar w:top="1440" w:right="1080" w:bottom="1440" w:left="1080" w:header="708" w:footer="708" w:gutter="0"/>
+          <w:cols w:space="708"/>
+          <w:docGrid w:linePitch="360"/>
+        </w:sectPr>
+      </w:pPr>
     </w:p>
     <w:p>
       <w:pPr>
@@ -1966,7 +2056,7 @@
           <w:sz w:val="22"/>
           <w:szCs w:val="22"/>
         </w:rPr>
-        <w:t>Scientific Reports</w:t>
+        <w:t>Computational Biology and Chemistry</w:t>
       </w:r>
     </w:p>
     <w:p>
@@ -1993,7 +2083,7 @@
           <w:sz w:val="22"/>
           <w:szCs w:val="22"/>
         </w:rPr>
-        <w:t>Chemical Papers</w:t>
+        <w:t>Scientific Reports</w:t>
       </w:r>
     </w:p>
     <w:p>
@@ -2020,7 +2110,86 @@
           <w:sz w:val="22"/>
           <w:szCs w:val="22"/>
         </w:rPr>
+        <w:t>Chemical Papers</w:t>
+      </w:r>
+    </w:p>
+    <w:p>
+      <w:pPr>
+        <w:pStyle w:val="ListParagraph"/>
+        <w:numPr>
+          <w:ilvl w:val="0"/>
+          <w:numId w:val="10"/>
+        </w:numPr>
+        <w:tabs>
+          <w:tab w:val="left" w:pos="2379"/>
+        </w:tabs>
+        <w:rPr>
+          <w:rFonts w:ascii="Optima" w:eastAsia="Microsoft GothicNeo" w:hAnsi="Optima" w:cs="CMU Sans Serif Medium"/>
+          <w:color w:val="000000" w:themeColor="text1"/>
+          <w:sz w:val="22"/>
+          <w:szCs w:val="22"/>
+        </w:rPr>
+      </w:pPr>
+      <w:r>
+        <w:rPr>
+          <w:rFonts w:ascii="Optima" w:eastAsia="Microsoft GothicNeo" w:hAnsi="Optima" w:cs="CMU Sans Serif Medium"/>
+          <w:color w:val="000000" w:themeColor="text1"/>
+          <w:sz w:val="22"/>
+          <w:szCs w:val="22"/>
+        </w:rPr>
         <w:t>Journal of Applied Physics</w:t>
+      </w:r>
+    </w:p>
+    <w:p>
+      <w:pPr>
+        <w:pStyle w:val="ListParagraph"/>
+        <w:numPr>
+          <w:ilvl w:val="0"/>
+          <w:numId w:val="10"/>
+        </w:numPr>
+        <w:tabs>
+          <w:tab w:val="left" w:pos="2379"/>
+        </w:tabs>
+        <w:rPr>
+          <w:rFonts w:ascii="Optima" w:eastAsia="Microsoft GothicNeo" w:hAnsi="Optima" w:cs="CMU Sans Serif Medium"/>
+          <w:color w:val="000000" w:themeColor="text1"/>
+          <w:sz w:val="22"/>
+          <w:szCs w:val="22"/>
+        </w:rPr>
+        <w:sectPr>
+          <w:type w:val="continuous"/>
+          <w:pgSz w:w="11906" w:h="16838"/>
+          <w:pgMar w:top="1440" w:right="1080" w:bottom="1440" w:left="1080" w:header="708" w:footer="708" w:gutter="0"/>
+          <w:cols w:num="2" w:space="708"/>
+          <w:docGrid w:linePitch="360"/>
+        </w:sectPr>
+      </w:pPr>
+    </w:p>
+    <w:p>
+      <w:pPr>
+        <w:pStyle w:val="ListParagraph"/>
+        <w:numPr>
+          <w:ilvl w:val="0"/>
+          <w:numId w:val="10"/>
+        </w:numPr>
+        <w:tabs>
+          <w:tab w:val="left" w:pos="2379"/>
+        </w:tabs>
+        <w:rPr>
+          <w:rFonts w:ascii="Optima" w:eastAsia="Microsoft GothicNeo" w:hAnsi="Optima" w:cs="CMU Sans Serif Medium"/>
+          <w:color w:val="000000" w:themeColor="text1"/>
+          <w:sz w:val="22"/>
+          <w:szCs w:val="22"/>
+        </w:rPr>
+      </w:pPr>
+      <w:r>
+        <w:rPr>
+          <w:rFonts w:ascii="Optima" w:eastAsia="Microsoft GothicNeo" w:hAnsi="Optima" w:cs="CMU Sans Serif Medium"/>
+          <w:color w:val="000000" w:themeColor="text1"/>
+          <w:sz w:val="22"/>
+          <w:szCs w:val="22"/>
+        </w:rPr>
+        <w:t>Journal of Chemical Sciences</w:t>
       </w:r>
     </w:p>
     <w:sectPr>
@@ -2035,7 +2204,7 @@
 </file>
 
 <file path=word/endnotes.xml><?xml version="1.0" encoding="utf-8"?>
-<w:endnotes xmlns:wpc="http://schemas.microsoft.com/office/word/2010/wordprocessingCanvas" xmlns:cx="http://schemas.microsoft.com/office/drawing/2014/chartex" xmlns:cx1="http://schemas.microsoft.com/office/drawing/2015/9/8/chartex" xmlns:cx2="http://schemas.microsoft.com/office/drawing/2015/10/21/chartex" xmlns:cx3="http://schemas.microsoft.com/office/drawing/2016/5/9/chartex" xmlns:cx4="http://schemas.microsoft.com/office/drawing/2016/5/10/chartex" xmlns:cx5="http://schemas.microsoft.com/office/drawing/2016/5/11/chartex" xmlns:cx6="http://schemas.microsoft.com/office/drawing/2016/5/12/chartex" xmlns:cx7="http://schemas.microsoft.com/office/drawing/2016/5/13/chartex" xmlns:cx8="http://schemas.microsoft.com/office/drawing/2016/5/14/chartex" xmlns:mc="http://schemas.openxmlformats.org/markup-compatibility/2006" xmlns:aink="http://schemas.microsoft.com/office/drawing/2016/ink" xmlns:am3d="http://schemas.microsoft.com/office/drawing/2017/model3d" xmlns:o="urn:schemas-microsoft-com:office:office" xmlns:oel="http://schemas.microsoft.com/office/2019/extlst" xmlns:r="http://schemas.openxmlformats.org/officeDocument/2006/relationships" xmlns:m="http://schemas.openxmlformats.org/officeDocument/2006/math" xmlns:v="urn:schemas-microsoft-com:vml" xmlns:wp14="http://schemas.microsoft.com/office/word/2010/wordprocessingDrawing" xmlns:wp="http://schemas.openxmlformats.org/drawingml/2006/wordprocessingDrawing" xmlns:w10="urn:schemas-microsoft-com:office:word" xmlns:w="http://schemas.openxmlformats.org/wordprocessingml/2006/main" xmlns:w14="http://schemas.microsoft.com/office/word/2010/wordml" xmlns:w15="http://schemas.microsoft.com/office/word/2012/wordml" xmlns:w16cex="http://schemas.microsoft.com/office/word/2018/wordml/cex" xmlns:w16cid="http://schemas.microsoft.com/office/word/2016/wordml/cid" xmlns:w16="http://schemas.microsoft.com/office/word/2018/wordml" xmlns:w16du="http://schemas.microsoft.com/office/word/2023/wordml/word16du" xmlns:w16sdtdh="http://schemas.microsoft.com/office/word/2020/wordml/sdtdatahash" xmlns:w16sdtfl="http://schemas.microsoft.com/office/word/2024/wordml/sdtformatlock" xmlns:w16se="http://schemas.microsoft.com/office/word/2015/wordml/symex" xmlns:wpg="http://schemas.microsoft.com/office/word/2010/wordprocessingGroup" xmlns:wpi="http://schemas.microsoft.com/office/word/2010/wordprocessingInk" xmlns:wne="http://schemas.microsoft.com/office/word/2006/wordml" xmlns:wps="http://schemas.microsoft.com/office/word/2010/wordprocessingShape" mc:Ignorable="w14 w15 w16se w16cid w16 w16cex w16sdtdh w16sdtfl w16du wp14">
+<w:endnotes xmlns:wpc="http://schemas.microsoft.com/office/word/2010/wordprocessingCanvas" xmlns:cx="http://schemas.microsoft.com/office/drawing/2014/chartex" xmlns:cx1="http://schemas.microsoft.com/office/drawing/2015/9/8/chartex" xmlns:cx2="http://schemas.microsoft.com/office/drawing/2015/10/21/chartex" xmlns:cx3="http://schemas.microsoft.com/office/drawing/2016/5/9/chartex" xmlns:cx4="http://schemas.microsoft.com/office/drawing/2016/5/10/chartex" xmlns:cx5="http://schemas.microsoft.com/office/drawing/2016/5/11/chartex" xmlns:cx6="http://schemas.microsoft.com/office/drawing/2016/5/12/chartex" xmlns:cx7="http://schemas.microsoft.com/office/drawing/2016/5/13/chartex" xmlns:cx8="http://schemas.microsoft.com/office/drawing/2016/5/14/chartex" xmlns:mc="http://schemas.openxmlformats.org/markup-compatibility/2006" xmlns:m="http://schemas.openxmlformats.org/officeDocument/2006/math" xmlns:aink="http://schemas.microsoft.com/office/drawing/2016/ink" xmlns:am3d="http://schemas.microsoft.com/office/drawing/2017/model3d" xmlns:oel="http://schemas.microsoft.com/office/2019/extlst" xmlns:r="http://schemas.openxmlformats.org/officeDocument/2006/relationships" xmlns:wp14="http://schemas.microsoft.com/office/word/2010/wordprocessingDrawing" xmlns:wp="http://schemas.openxmlformats.org/drawingml/2006/wordprocessingDrawing" xmlns:wpg="http://schemas.microsoft.com/office/word/2010/wordprocessingGroup" xmlns:wpi="http://schemas.microsoft.com/office/word/2010/wordprocessingInk" xmlns:wps="http://schemas.microsoft.com/office/word/2010/wordprocessingShape" xmlns:o="urn:schemas-microsoft-com:office:office" xmlns:v="urn:schemas-microsoft-com:vml" xmlns:w10="urn:schemas-microsoft-com:office:word" xmlns:w="http://schemas.openxmlformats.org/wordprocessingml/2006/main" xmlns:w14="http://schemas.microsoft.com/office/word/2010/wordml" xmlns:w15="http://schemas.microsoft.com/office/word/2012/wordml" xmlns:w16cei="http://schemas.microsoft.com/office/word/2026/wordml/cei" xmlns:w16cex="http://schemas.microsoft.com/office/word/2018/wordml/cex" xmlns:w16cid="http://schemas.microsoft.com/office/word/2016/wordml/cid" xmlns:w16="http://schemas.microsoft.com/office/word/2018/wordml" xmlns:w16sdtdh="http://schemas.microsoft.com/office/word/2020/wordml/sdtdatahash" xmlns:w16sdtfl="http://schemas.microsoft.com/office/word/2024/wordml/sdtformatlock" xmlns:w16se="http://schemas.microsoft.com/office/word/2015/wordml/symex" xmlns:w16du="http://schemas.microsoft.com/office/word/2023/wordml/word16du" xmlns:wne="http://schemas.microsoft.com/office/word/2006/wordml" mc:Ignorable="w14 w15 w16se w16cid w16 w16cex w16sdtdh w16sdtfl w16du wp14">
   <w:endnote w:type="separator" w:id="-1">
     <w:p>
       <w:r>
@@ -2054,7 +2223,7 @@
 </file>
 
 <file path=word/footer1.xml><?xml version="1.0" encoding="utf-8"?>
-<w:ftr xmlns:wpc="http://schemas.microsoft.com/office/word/2010/wordprocessingCanvas" xmlns:cx="http://schemas.microsoft.com/office/drawing/2014/chartex" xmlns:cx1="http://schemas.microsoft.com/office/drawing/2015/9/8/chartex" xmlns:cx2="http://schemas.microsoft.com/office/drawing/2015/10/21/chartex" xmlns:cx3="http://schemas.microsoft.com/office/drawing/2016/5/9/chartex" xmlns:cx4="http://schemas.microsoft.com/office/drawing/2016/5/10/chartex" xmlns:cx5="http://schemas.microsoft.com/office/drawing/2016/5/11/chartex" xmlns:cx6="http://schemas.microsoft.com/office/drawing/2016/5/12/chartex" xmlns:cx7="http://schemas.microsoft.com/office/drawing/2016/5/13/chartex" xmlns:cx8="http://schemas.microsoft.com/office/drawing/2016/5/14/chartex" xmlns:mc="http://schemas.openxmlformats.org/markup-compatibility/2006" xmlns:aink="http://schemas.microsoft.com/office/drawing/2016/ink" xmlns:am3d="http://schemas.microsoft.com/office/drawing/2017/model3d" xmlns:o="urn:schemas-microsoft-com:office:office" xmlns:oel="http://schemas.microsoft.com/office/2019/extlst" xmlns:r="http://schemas.openxmlformats.org/officeDocument/2006/relationships" xmlns:m="http://schemas.openxmlformats.org/officeDocument/2006/math" xmlns:v="urn:schemas-microsoft-com:vml" xmlns:wp14="http://schemas.microsoft.com/office/word/2010/wordprocessingDrawing" xmlns:wp="http://schemas.openxmlformats.org/drawingml/2006/wordprocessingDrawing" xmlns:w10="urn:schemas-microsoft-com:office:word" xmlns:w="http://schemas.openxmlformats.org/wordprocessingml/2006/main" xmlns:w14="http://schemas.microsoft.com/office/word/2010/wordml" xmlns:w15="http://schemas.microsoft.com/office/word/2012/wordml" xmlns:w16cex="http://schemas.microsoft.com/office/word/2018/wordml/cex" xmlns:w16cid="http://schemas.microsoft.com/office/word/2016/wordml/cid" xmlns:w16="http://schemas.microsoft.com/office/word/2018/wordml" xmlns:w16du="http://schemas.microsoft.com/office/word/2023/wordml/word16du" xmlns:w16sdtdh="http://schemas.microsoft.com/office/word/2020/wordml/sdtdatahash" xmlns:w16sdtfl="http://schemas.microsoft.com/office/word/2024/wordml/sdtformatlock" xmlns:w16se="http://schemas.microsoft.com/office/word/2015/wordml/symex" xmlns:wpg="http://schemas.microsoft.com/office/word/2010/wordprocessingGroup" xmlns:wpi="http://schemas.microsoft.com/office/word/2010/wordprocessingInk" xmlns:wne="http://schemas.microsoft.com/office/word/2006/wordml" xmlns:wps="http://schemas.microsoft.com/office/word/2010/wordprocessingShape" mc:Ignorable="w14 w15 w16se w16cid w16 w16cex w16sdtdh w16sdtfl w16du wp14">
+<w:ftr xmlns:wpc="http://schemas.microsoft.com/office/word/2010/wordprocessingCanvas" xmlns:cx="http://schemas.microsoft.com/office/drawing/2014/chartex" xmlns:cx1="http://schemas.microsoft.com/office/drawing/2015/9/8/chartex" xmlns:cx2="http://schemas.microsoft.com/office/drawing/2015/10/21/chartex" xmlns:cx3="http://schemas.microsoft.com/office/drawing/2016/5/9/chartex" xmlns:cx4="http://schemas.microsoft.com/office/drawing/2016/5/10/chartex" xmlns:cx5="http://schemas.microsoft.com/office/drawing/2016/5/11/chartex" xmlns:cx6="http://schemas.microsoft.com/office/drawing/2016/5/12/chartex" xmlns:cx7="http://schemas.microsoft.com/office/drawing/2016/5/13/chartex" xmlns:cx8="http://schemas.microsoft.com/office/drawing/2016/5/14/chartex" xmlns:mc="http://schemas.openxmlformats.org/markup-compatibility/2006" xmlns:m="http://schemas.openxmlformats.org/officeDocument/2006/math" xmlns:aink="http://schemas.microsoft.com/office/drawing/2016/ink" xmlns:am3d="http://schemas.microsoft.com/office/drawing/2017/model3d" xmlns:oel="http://schemas.microsoft.com/office/2019/extlst" xmlns:r="http://schemas.openxmlformats.org/officeDocument/2006/relationships" xmlns:wp14="http://schemas.microsoft.com/office/word/2010/wordprocessingDrawing" xmlns:wp="http://schemas.openxmlformats.org/drawingml/2006/wordprocessingDrawing" xmlns:wpg="http://schemas.microsoft.com/office/word/2010/wordprocessingGroup" xmlns:wpi="http://schemas.microsoft.com/office/word/2010/wordprocessingInk" xmlns:wps="http://schemas.microsoft.com/office/word/2010/wordprocessingShape" xmlns:o="urn:schemas-microsoft-com:office:office" xmlns:v="urn:schemas-microsoft-com:vml" xmlns:w10="urn:schemas-microsoft-com:office:word" xmlns:w="http://schemas.openxmlformats.org/wordprocessingml/2006/main" xmlns:w14="http://schemas.microsoft.com/office/word/2010/wordml" xmlns:w15="http://schemas.microsoft.com/office/word/2012/wordml" xmlns:w16cei="http://schemas.microsoft.com/office/word/2026/wordml/cei" xmlns:w16cex="http://schemas.microsoft.com/office/word/2018/wordml/cex" xmlns:w16cid="http://schemas.microsoft.com/office/word/2016/wordml/cid" xmlns:w16="http://schemas.microsoft.com/office/word/2018/wordml" xmlns:w16sdtdh="http://schemas.microsoft.com/office/word/2020/wordml/sdtdatahash" xmlns:w16sdtfl="http://schemas.microsoft.com/office/word/2024/wordml/sdtformatlock" xmlns:w16se="http://schemas.microsoft.com/office/word/2015/wordml/symex" xmlns:w16du="http://schemas.microsoft.com/office/word/2023/wordml/word16du" xmlns:wne="http://schemas.microsoft.com/office/word/2006/wordml" mc:Ignorable="w14 w15 w16se w16cid w16 w16cex w16sdtdh w16sdtfl w16du wp14">
   <w:sdt>
     <w:sdtPr>
       <w:rPr>
@@ -2119,7 +2288,7 @@
 </file>
 
 <file path=word/footer2.xml><?xml version="1.0" encoding="utf-8"?>
-<w:ftr xmlns:wpc="http://schemas.microsoft.com/office/word/2010/wordprocessingCanvas" xmlns:cx="http://schemas.microsoft.com/office/drawing/2014/chartex" xmlns:cx1="http://schemas.microsoft.com/office/drawing/2015/9/8/chartex" xmlns:cx2="http://schemas.microsoft.com/office/drawing/2015/10/21/chartex" xmlns:cx3="http://schemas.microsoft.com/office/drawing/2016/5/9/chartex" xmlns:cx4="http://schemas.microsoft.com/office/drawing/2016/5/10/chartex" xmlns:cx5="http://schemas.microsoft.com/office/drawing/2016/5/11/chartex" xmlns:cx6="http://schemas.microsoft.com/office/drawing/2016/5/12/chartex" xmlns:cx7="http://schemas.microsoft.com/office/drawing/2016/5/13/chartex" xmlns:cx8="http://schemas.microsoft.com/office/drawing/2016/5/14/chartex" xmlns:mc="http://schemas.openxmlformats.org/markup-compatibility/2006" xmlns:aink="http://schemas.microsoft.com/office/drawing/2016/ink" xmlns:am3d="http://schemas.microsoft.com/office/drawing/2017/model3d" xmlns:o="urn:schemas-microsoft-com:office:office" xmlns:oel="http://schemas.microsoft.com/office/2019/extlst" xmlns:r="http://schemas.openxmlformats.org/officeDocument/2006/relationships" xmlns:m="http://schemas.openxmlformats.org/officeDocument/2006/math" xmlns:v="urn:schemas-microsoft-com:vml" xmlns:wp14="http://schemas.microsoft.com/office/word/2010/wordprocessingDrawing" xmlns:wp="http://schemas.openxmlformats.org/drawingml/2006/wordprocessingDrawing" xmlns:w10="urn:schemas-microsoft-com:office:word" xmlns:w="http://schemas.openxmlformats.org/wordprocessingml/2006/main" xmlns:w14="http://schemas.microsoft.com/office/word/2010/wordml" xmlns:w15="http://schemas.microsoft.com/office/word/2012/wordml" xmlns:w16cex="http://schemas.microsoft.com/office/word/2018/wordml/cex" xmlns:w16cid="http://schemas.microsoft.com/office/word/2016/wordml/cid" xmlns:w16="http://schemas.microsoft.com/office/word/2018/wordml" xmlns:w16du="http://schemas.microsoft.com/office/word/2023/wordml/word16du" xmlns:w16sdtdh="http://schemas.microsoft.com/office/word/2020/wordml/sdtdatahash" xmlns:w16sdtfl="http://schemas.microsoft.com/office/word/2024/wordml/sdtformatlock" xmlns:w16se="http://schemas.microsoft.com/office/word/2015/wordml/symex" xmlns:wpg="http://schemas.microsoft.com/office/word/2010/wordprocessingGroup" xmlns:wpi="http://schemas.microsoft.com/office/word/2010/wordprocessingInk" xmlns:wne="http://schemas.microsoft.com/office/word/2006/wordml" xmlns:wps="http://schemas.microsoft.com/office/word/2010/wordprocessingShape" mc:Ignorable="w14 w15 w16se w16cid w16 w16cex w16sdtdh w16sdtfl w16du wp14">
+<w:ftr xmlns:wpc="http://schemas.microsoft.com/office/word/2010/wordprocessingCanvas" xmlns:cx="http://schemas.microsoft.com/office/drawing/2014/chartex" xmlns:cx1="http://schemas.microsoft.com/office/drawing/2015/9/8/chartex" xmlns:cx2="http://schemas.microsoft.com/office/drawing/2015/10/21/chartex" xmlns:cx3="http://schemas.microsoft.com/office/drawing/2016/5/9/chartex" xmlns:cx4="http://schemas.microsoft.com/office/drawing/2016/5/10/chartex" xmlns:cx5="http://schemas.microsoft.com/office/drawing/2016/5/11/chartex" xmlns:cx6="http://schemas.microsoft.com/office/drawing/2016/5/12/chartex" xmlns:cx7="http://schemas.microsoft.com/office/drawing/2016/5/13/chartex" xmlns:cx8="http://schemas.microsoft.com/office/drawing/2016/5/14/chartex" xmlns:mc="http://schemas.openxmlformats.org/markup-compatibility/2006" xmlns:m="http://schemas.openxmlformats.org/officeDocument/2006/math" xmlns:aink="http://schemas.microsoft.com/office/drawing/2016/ink" xmlns:am3d="http://schemas.microsoft.com/office/drawing/2017/model3d" xmlns:oel="http://schemas.microsoft.com/office/2019/extlst" xmlns:r="http://schemas.openxmlformats.org/officeDocument/2006/relationships" xmlns:wp14="http://schemas.microsoft.com/office/word/2010/wordprocessingDrawing" xmlns:wp="http://schemas.openxmlformats.org/drawingml/2006/wordprocessingDrawing" xmlns:wpg="http://schemas.microsoft.com/office/word/2010/wordprocessingGroup" xmlns:wpi="http://schemas.microsoft.com/office/word/2010/wordprocessingInk" xmlns:wps="http://schemas.microsoft.com/office/word/2010/wordprocessingShape" xmlns:o="urn:schemas-microsoft-com:office:office" xmlns:v="urn:schemas-microsoft-com:vml" xmlns:w10="urn:schemas-microsoft-com:office:word" xmlns:w="http://schemas.openxmlformats.org/wordprocessingml/2006/main" xmlns:w14="http://schemas.microsoft.com/office/word/2010/wordml" xmlns:w15="http://schemas.microsoft.com/office/word/2012/wordml" xmlns:w16cei="http://schemas.microsoft.com/office/word/2026/wordml/cei" xmlns:w16cex="http://schemas.microsoft.com/office/word/2018/wordml/cex" xmlns:w16cid="http://schemas.microsoft.com/office/word/2016/wordml/cid" xmlns:w16="http://schemas.microsoft.com/office/word/2018/wordml" xmlns:w16sdtdh="http://schemas.microsoft.com/office/word/2020/wordml/sdtdatahash" xmlns:w16sdtfl="http://schemas.microsoft.com/office/word/2024/wordml/sdtformatlock" xmlns:w16se="http://schemas.microsoft.com/office/word/2015/wordml/symex" xmlns:w16du="http://schemas.microsoft.com/office/word/2023/wordml/word16du" xmlns:wne="http://schemas.microsoft.com/office/word/2006/wordml" mc:Ignorable="w14 w15 w16se w16cid w16 w16cex w16sdtdh w16sdtfl w16du wp14">
   <w:p>
     <w:pPr>
       <w:pStyle w:val="Footer"/>
@@ -2130,7 +2299,7 @@
 </file>
 
 <file path=word/footer3.xml><?xml version="1.0" encoding="utf-8"?>
-<w:ftr xmlns:wpc="http://schemas.microsoft.com/office/word/2010/wordprocessingCanvas" xmlns:cx="http://schemas.microsoft.com/office/drawing/2014/chartex" xmlns:cx1="http://schemas.microsoft.com/office/drawing/2015/9/8/chartex" xmlns:cx2="http://schemas.microsoft.com/office/drawing/2015/10/21/chartex" xmlns:cx3="http://schemas.microsoft.com/office/drawing/2016/5/9/chartex" xmlns:cx4="http://schemas.microsoft.com/office/drawing/2016/5/10/chartex" xmlns:cx5="http://schemas.microsoft.com/office/drawing/2016/5/11/chartex" xmlns:cx6="http://schemas.microsoft.com/office/drawing/2016/5/12/chartex" xmlns:cx7="http://schemas.microsoft.com/office/drawing/2016/5/13/chartex" xmlns:cx8="http://schemas.microsoft.com/office/drawing/2016/5/14/chartex" xmlns:mc="http://schemas.openxmlformats.org/markup-compatibility/2006" xmlns:aink="http://schemas.microsoft.com/office/drawing/2016/ink" xmlns:am3d="http://schemas.microsoft.com/office/drawing/2017/model3d" xmlns:o="urn:schemas-microsoft-com:office:office" xmlns:oel="http://schemas.microsoft.com/office/2019/extlst" xmlns:r="http://schemas.openxmlformats.org/officeDocument/2006/relationships" xmlns:m="http://schemas.openxmlformats.org/officeDocument/2006/math" xmlns:v="urn:schemas-microsoft-com:vml" xmlns:wp14="http://schemas.microsoft.com/office/word/2010/wordprocessingDrawing" xmlns:wp="http://schemas.openxmlformats.org/drawingml/2006/wordprocessingDrawing" xmlns:w10="urn:schemas-microsoft-com:office:word" xmlns:w="http://schemas.openxmlformats.org/wordprocessingml/2006/main" xmlns:w14="http://schemas.microsoft.com/office/word/2010/wordml" xmlns:w15="http://schemas.microsoft.com/office/word/2012/wordml" xmlns:w16cex="http://schemas.microsoft.com/office/word/2018/wordml/cex" xmlns:w16cid="http://schemas.microsoft.com/office/word/2016/wordml/cid" xmlns:w16="http://schemas.microsoft.com/office/word/2018/wordml" xmlns:w16du="http://schemas.microsoft.com/office/word/2023/wordml/word16du" xmlns:w16sdtdh="http://schemas.microsoft.com/office/word/2020/wordml/sdtdatahash" xmlns:w16sdtfl="http://schemas.microsoft.com/office/word/2024/wordml/sdtformatlock" xmlns:w16se="http://schemas.microsoft.com/office/word/2015/wordml/symex" xmlns:wpg="http://schemas.microsoft.com/office/word/2010/wordprocessingGroup" xmlns:wpi="http://schemas.microsoft.com/office/word/2010/wordprocessingInk" xmlns:wne="http://schemas.microsoft.com/office/word/2006/wordml" xmlns:wps="http://schemas.microsoft.com/office/word/2010/wordprocessingShape" mc:Ignorable="w14 w15 w16se w16cid w16 w16cex w16sdtdh w16sdtfl w16du wp14">
+<w:ftr xmlns:wpc="http://schemas.microsoft.com/office/word/2010/wordprocessingCanvas" xmlns:cx="http://schemas.microsoft.com/office/drawing/2014/chartex" xmlns:cx1="http://schemas.microsoft.com/office/drawing/2015/9/8/chartex" xmlns:cx2="http://schemas.microsoft.com/office/drawing/2015/10/21/chartex" xmlns:cx3="http://schemas.microsoft.com/office/drawing/2016/5/9/chartex" xmlns:cx4="http://schemas.microsoft.com/office/drawing/2016/5/10/chartex" xmlns:cx5="http://schemas.microsoft.com/office/drawing/2016/5/11/chartex" xmlns:cx6="http://schemas.microsoft.com/office/drawing/2016/5/12/chartex" xmlns:cx7="http://schemas.microsoft.com/office/drawing/2016/5/13/chartex" xmlns:cx8="http://schemas.microsoft.com/office/drawing/2016/5/14/chartex" xmlns:mc="http://schemas.openxmlformats.org/markup-compatibility/2006" xmlns:m="http://schemas.openxmlformats.org/officeDocument/2006/math" xmlns:aink="http://schemas.microsoft.com/office/drawing/2016/ink" xmlns:am3d="http://schemas.microsoft.com/office/drawing/2017/model3d" xmlns:oel="http://schemas.microsoft.com/office/2019/extlst" xmlns:r="http://schemas.openxmlformats.org/officeDocument/2006/relationships" xmlns:wp14="http://schemas.microsoft.com/office/word/2010/wordprocessingDrawing" xmlns:wp="http://schemas.openxmlformats.org/drawingml/2006/wordprocessingDrawing" xmlns:wpg="http://schemas.microsoft.com/office/word/2010/wordprocessingGroup" xmlns:wpi="http://schemas.microsoft.com/office/word/2010/wordprocessingInk" xmlns:wps="http://schemas.microsoft.com/office/word/2010/wordprocessingShape" xmlns:o="urn:schemas-microsoft-com:office:office" xmlns:v="urn:schemas-microsoft-com:vml" xmlns:w10="urn:schemas-microsoft-com:office:word" xmlns:w="http://schemas.openxmlformats.org/wordprocessingml/2006/main" xmlns:w14="http://schemas.microsoft.com/office/word/2010/wordml" xmlns:w15="http://schemas.microsoft.com/office/word/2012/wordml" xmlns:w16cei="http://schemas.microsoft.com/office/word/2026/wordml/cei" xmlns:w16cex="http://schemas.microsoft.com/office/word/2018/wordml/cex" xmlns:w16cid="http://schemas.microsoft.com/office/word/2016/wordml/cid" xmlns:w16="http://schemas.microsoft.com/office/word/2018/wordml" xmlns:w16sdtdh="http://schemas.microsoft.com/office/word/2020/wordml/sdtdatahash" xmlns:w16sdtfl="http://schemas.microsoft.com/office/word/2024/wordml/sdtformatlock" xmlns:w16se="http://schemas.microsoft.com/office/word/2015/wordml/symex" xmlns:w16du="http://schemas.microsoft.com/office/word/2023/wordml/word16du" xmlns:wne="http://schemas.microsoft.com/office/word/2006/wordml" mc:Ignorable="w14 w15 w16se w16cid w16 w16cex w16sdtdh w16sdtfl w16du wp14">
   <w:sdt>
     <w:sdtPr>
       <w:rPr>
@@ -2195,7 +2364,7 @@
 </file>
 
 <file path=word/footer4.xml><?xml version="1.0" encoding="utf-8"?>
-<w:ftr xmlns:wpc="http://schemas.microsoft.com/office/word/2010/wordprocessingCanvas" xmlns:cx="http://schemas.microsoft.com/office/drawing/2014/chartex" xmlns:cx1="http://schemas.microsoft.com/office/drawing/2015/9/8/chartex" xmlns:cx2="http://schemas.microsoft.com/office/drawing/2015/10/21/chartex" xmlns:cx3="http://schemas.microsoft.com/office/drawing/2016/5/9/chartex" xmlns:cx4="http://schemas.microsoft.com/office/drawing/2016/5/10/chartex" xmlns:cx5="http://schemas.microsoft.com/office/drawing/2016/5/11/chartex" xmlns:cx6="http://schemas.microsoft.com/office/drawing/2016/5/12/chartex" xmlns:cx7="http://schemas.microsoft.com/office/drawing/2016/5/13/chartex" xmlns:cx8="http://schemas.microsoft.com/office/drawing/2016/5/14/chartex" xmlns:mc="http://schemas.openxmlformats.org/markup-compatibility/2006" xmlns:aink="http://schemas.microsoft.com/office/drawing/2016/ink" xmlns:am3d="http://schemas.microsoft.com/office/drawing/2017/model3d" xmlns:o="urn:schemas-microsoft-com:office:office" xmlns:oel="http://schemas.microsoft.com/office/2019/extlst" xmlns:r="http://schemas.openxmlformats.org/officeDocument/2006/relationships" xmlns:m="http://schemas.openxmlformats.org/officeDocument/2006/math" xmlns:v="urn:schemas-microsoft-com:vml" xmlns:wp14="http://schemas.microsoft.com/office/word/2010/wordprocessingDrawing" xmlns:wp="http://schemas.openxmlformats.org/drawingml/2006/wordprocessingDrawing" xmlns:w10="urn:schemas-microsoft-com:office:word" xmlns:w="http://schemas.openxmlformats.org/wordprocessingml/2006/main" xmlns:w14="http://schemas.microsoft.com/office/word/2010/wordml" xmlns:w15="http://schemas.microsoft.com/office/word/2012/wordml" xmlns:w16cex="http://schemas.microsoft.com/office/word/2018/wordml/cex" xmlns:w16cid="http://schemas.microsoft.com/office/word/2016/wordml/cid" xmlns:w16="http://schemas.microsoft.com/office/word/2018/wordml" xmlns:w16du="http://schemas.microsoft.com/office/word/2023/wordml/word16du" xmlns:w16sdtdh="http://schemas.microsoft.com/office/word/2020/wordml/sdtdatahash" xmlns:w16sdtfl="http://schemas.microsoft.com/office/word/2024/wordml/sdtformatlock" xmlns:w16se="http://schemas.microsoft.com/office/word/2015/wordml/symex" xmlns:wpg="http://schemas.microsoft.com/office/word/2010/wordprocessingGroup" xmlns:wpi="http://schemas.microsoft.com/office/word/2010/wordprocessingInk" xmlns:wne="http://schemas.microsoft.com/office/word/2006/wordml" xmlns:wps="http://schemas.microsoft.com/office/word/2010/wordprocessingShape" mc:Ignorable="w14 w15 w16se w16cid w16 w16cex w16sdtdh w16sdtfl w16du wp14">
+<w:ftr xmlns:wpc="http://schemas.microsoft.com/office/word/2010/wordprocessingCanvas" xmlns:cx="http://schemas.microsoft.com/office/drawing/2014/chartex" xmlns:cx1="http://schemas.microsoft.com/office/drawing/2015/9/8/chartex" xmlns:cx2="http://schemas.microsoft.com/office/drawing/2015/10/21/chartex" xmlns:cx3="http://schemas.microsoft.com/office/drawing/2016/5/9/chartex" xmlns:cx4="http://schemas.microsoft.com/office/drawing/2016/5/10/chartex" xmlns:cx5="http://schemas.microsoft.com/office/drawing/2016/5/11/chartex" xmlns:cx6="http://schemas.microsoft.com/office/drawing/2016/5/12/chartex" xmlns:cx7="http://schemas.microsoft.com/office/drawing/2016/5/13/chartex" xmlns:cx8="http://schemas.microsoft.com/office/drawing/2016/5/14/chartex" xmlns:mc="http://schemas.openxmlformats.org/markup-compatibility/2006" xmlns:m="http://schemas.openxmlformats.org/officeDocument/2006/math" xmlns:aink="http://schemas.microsoft.com/office/drawing/2016/ink" xmlns:am3d="http://schemas.microsoft.com/office/drawing/2017/model3d" xmlns:oel="http://schemas.microsoft.com/office/2019/extlst" xmlns:r="http://schemas.openxmlformats.org/officeDocument/2006/relationships" xmlns:wp14="http://schemas.microsoft.com/office/word/2010/wordprocessingDrawing" xmlns:wp="http://schemas.openxmlformats.org/drawingml/2006/wordprocessingDrawing" xmlns:wpg="http://schemas.microsoft.com/office/word/2010/wordprocessingGroup" xmlns:wpi="http://schemas.microsoft.com/office/word/2010/wordprocessingInk" xmlns:wps="http://schemas.microsoft.com/office/word/2010/wordprocessingShape" xmlns:o="urn:schemas-microsoft-com:office:office" xmlns:v="urn:schemas-microsoft-com:vml" xmlns:w10="urn:schemas-microsoft-com:office:word" xmlns:w="http://schemas.openxmlformats.org/wordprocessingml/2006/main" xmlns:w14="http://schemas.microsoft.com/office/word/2010/wordml" xmlns:w15="http://schemas.microsoft.com/office/word/2012/wordml" xmlns:w16cei="http://schemas.microsoft.com/office/word/2026/wordml/cei" xmlns:w16cex="http://schemas.microsoft.com/office/word/2018/wordml/cex" xmlns:w16cid="http://schemas.microsoft.com/office/word/2016/wordml/cid" xmlns:w16="http://schemas.microsoft.com/office/word/2018/wordml" xmlns:w16sdtdh="http://schemas.microsoft.com/office/word/2020/wordml/sdtdatahash" xmlns:w16sdtfl="http://schemas.microsoft.com/office/word/2024/wordml/sdtformatlock" xmlns:w16se="http://schemas.microsoft.com/office/word/2015/wordml/symex" xmlns:w16du="http://schemas.microsoft.com/office/word/2023/wordml/word16du" xmlns:wne="http://schemas.microsoft.com/office/word/2006/wordml" mc:Ignorable="w14 w15 w16se w16cid w16 w16cex w16sdtdh w16sdtfl w16du wp14">
   <w:p>
     <w:pPr>
       <w:pStyle w:val="Footer"/>
@@ -2206,7 +2375,7 @@
 </file>
 
 <file path=word/footnotes.xml><?xml version="1.0" encoding="utf-8"?>
-<w:footnotes xmlns:wpc="http://schemas.microsoft.com/office/word/2010/wordprocessingCanvas" xmlns:cx="http://schemas.microsoft.com/office/drawing/2014/chartex" xmlns:cx1="http://schemas.microsoft.com/office/drawing/2015/9/8/chartex" xmlns:cx2="http://schemas.microsoft.com/office/drawing/2015/10/21/chartex" xmlns:cx3="http://schemas.microsoft.com/office/drawing/2016/5/9/chartex" xmlns:cx4="http://schemas.microsoft.com/office/drawing/2016/5/10/chartex" xmlns:cx5="http://schemas.microsoft.com/office/drawing/2016/5/11/chartex" xmlns:cx6="http://schemas.microsoft.com/office/drawing/2016/5/12/chartex" xmlns:cx7="http://schemas.microsoft.com/office/drawing/2016/5/13/chartex" xmlns:cx8="http://schemas.microsoft.com/office/drawing/2016/5/14/chartex" xmlns:mc="http://schemas.openxmlformats.org/markup-compatibility/2006" xmlns:aink="http://schemas.microsoft.com/office/drawing/2016/ink" xmlns:am3d="http://schemas.microsoft.com/office/drawing/2017/model3d" xmlns:o="urn:schemas-microsoft-com:office:office" xmlns:oel="http://schemas.microsoft.com/office/2019/extlst" xmlns:r="http://schemas.openxmlformats.org/officeDocument/2006/relationships" xmlns:m="http://schemas.openxmlformats.org/officeDocument/2006/math" xmlns:v="urn:schemas-microsoft-com:vml" xmlns:wp14="http://schemas.microsoft.com/office/word/2010/wordprocessingDrawing" xmlns:wp="http://schemas.openxmlformats.org/drawingml/2006/wordprocessingDrawing" xmlns:w10="urn:schemas-microsoft-com:office:word" xmlns:w="http://schemas.openxmlformats.org/wordprocessingml/2006/main" xmlns:w14="http://schemas.microsoft.com/office/word/2010/wordml" xmlns:w15="http://schemas.microsoft.com/office/word/2012/wordml" xmlns:w16cex="http://schemas.microsoft.com/office/word/2018/wordml/cex" xmlns:w16cid="http://schemas.microsoft.com/office/word/2016/wordml/cid" xmlns:w16="http://schemas.microsoft.com/office/word/2018/wordml" xmlns:w16du="http://schemas.microsoft.com/office/word/2023/wordml/word16du" xmlns:w16sdtdh="http://schemas.microsoft.com/office/word/2020/wordml/sdtdatahash" xmlns:w16sdtfl="http://schemas.microsoft.com/office/word/2024/wordml/sdtformatlock" xmlns:w16se="http://schemas.microsoft.com/office/word/2015/wordml/symex" xmlns:wpg="http://schemas.microsoft.com/office/word/2010/wordprocessingGroup" xmlns:wpi="http://schemas.microsoft.com/office/word/2010/wordprocessingInk" xmlns:wne="http://schemas.microsoft.com/office/word/2006/wordml" xmlns:wps="http://schemas.microsoft.com/office/word/2010/wordprocessingShape" mc:Ignorable="w14 w15 w16se w16cid w16 w16cex w16sdtdh w16sdtfl w16du wp14">
+<w:footnotes xmlns:wpc="http://schemas.microsoft.com/office/word/2010/wordprocessingCanvas" xmlns:cx="http://schemas.microsoft.com/office/drawing/2014/chartex" xmlns:cx1="http://schemas.microsoft.com/office/drawing/2015/9/8/chartex" xmlns:cx2="http://schemas.microsoft.com/office/drawing/2015/10/21/chartex" xmlns:cx3="http://schemas.microsoft.com/office/drawing/2016/5/9/chartex" xmlns:cx4="http://schemas.microsoft.com/office/drawing/2016/5/10/chartex" xmlns:cx5="http://schemas.microsoft.com/office/drawing/2016/5/11/chartex" xmlns:cx6="http://schemas.microsoft.com/office/drawing/2016/5/12/chartex" xmlns:cx7="http://schemas.microsoft.com/office/drawing/2016/5/13/chartex" xmlns:cx8="http://schemas.microsoft.com/office/drawing/2016/5/14/chartex" xmlns:mc="http://schemas.openxmlformats.org/markup-compatibility/2006" xmlns:m="http://schemas.openxmlformats.org/officeDocument/2006/math" xmlns:aink="http://schemas.microsoft.com/office/drawing/2016/ink" xmlns:am3d="http://schemas.microsoft.com/office/drawing/2017/model3d" xmlns:oel="http://schemas.microsoft.com/office/2019/extlst" xmlns:r="http://schemas.openxmlformats.org/officeDocument/2006/relationships" xmlns:wp14="http://schemas.microsoft.com/office/word/2010/wordprocessingDrawing" xmlns:wp="http://schemas.openxmlformats.org/drawingml/2006/wordprocessingDrawing" xmlns:wpg="http://schemas.microsoft.com/office/word/2010/wordprocessingGroup" xmlns:wpi="http://schemas.microsoft.com/office/word/2010/wordprocessingInk" xmlns:wps="http://schemas.microsoft.com/office/word/2010/wordprocessingShape" xmlns:o="urn:schemas-microsoft-com:office:office" xmlns:v="urn:schemas-microsoft-com:vml" xmlns:w10="urn:schemas-microsoft-com:office:word" xmlns:w="http://schemas.openxmlformats.org/wordprocessingml/2006/main" xmlns:w14="http://schemas.microsoft.com/office/word/2010/wordml" xmlns:w15="http://schemas.microsoft.com/office/word/2012/wordml" xmlns:w16cei="http://schemas.microsoft.com/office/word/2026/wordml/cei" xmlns:w16cex="http://schemas.microsoft.com/office/word/2018/wordml/cex" xmlns:w16cid="http://schemas.microsoft.com/office/word/2016/wordml/cid" xmlns:w16="http://schemas.microsoft.com/office/word/2018/wordml" xmlns:w16sdtdh="http://schemas.microsoft.com/office/word/2020/wordml/sdtdatahash" xmlns:w16sdtfl="http://schemas.microsoft.com/office/word/2024/wordml/sdtformatlock" xmlns:w16se="http://schemas.microsoft.com/office/word/2015/wordml/symex" xmlns:w16du="http://schemas.microsoft.com/office/word/2023/wordml/word16du" xmlns:wne="http://schemas.microsoft.com/office/word/2006/wordml" mc:Ignorable="w14 w15 w16se w16cid w16 w16cex w16sdtdh w16sdtfl w16du wp14">
   <w:footnote w:type="separator" w:id="-1">
     <w:p>
       <w:r>
@@ -2225,7 +2394,7 @@
 </file>
 
 <file path=word/numbering.xml><?xml version="1.0" encoding="utf-8"?>
-<w:numbering xmlns:wpc="http://schemas.microsoft.com/office/word/2010/wordprocessingCanvas" xmlns:cx="http://schemas.microsoft.com/office/drawing/2014/chartex" xmlns:cx1="http://schemas.microsoft.com/office/drawing/2015/9/8/chartex" xmlns:cx2="http://schemas.microsoft.com/office/drawing/2015/10/21/chartex" xmlns:cx3="http://schemas.microsoft.com/office/drawing/2016/5/9/chartex" xmlns:cx4="http://schemas.microsoft.com/office/drawing/2016/5/10/chartex" xmlns:cx5="http://schemas.microsoft.com/office/drawing/2016/5/11/chartex" xmlns:cx6="http://schemas.microsoft.com/office/drawing/2016/5/12/chartex" xmlns:cx7="http://schemas.microsoft.com/office/drawing/2016/5/13/chartex" xmlns:cx8="http://schemas.microsoft.com/office/drawing/2016/5/14/chartex" xmlns:mc="http://schemas.openxmlformats.org/markup-compatibility/2006" xmlns:aink="http://schemas.microsoft.com/office/drawing/2016/ink" xmlns:am3d="http://schemas.microsoft.com/office/drawing/2017/model3d" xmlns:o="urn:schemas-microsoft-com:office:office" xmlns:oel="http://schemas.microsoft.com/office/2019/extlst" xmlns:r="http://schemas.openxmlformats.org/officeDocument/2006/relationships" xmlns:m="http://schemas.openxmlformats.org/officeDocument/2006/math" xmlns:v="urn:schemas-microsoft-com:vml" xmlns:wp14="http://schemas.microsoft.com/office/word/2010/wordprocessingDrawing" xmlns:wp="http://schemas.openxmlformats.org/drawingml/2006/wordprocessingDrawing" xmlns:w10="urn:schemas-microsoft-com:office:word" xmlns:w="http://schemas.openxmlformats.org/wordprocessingml/2006/main" xmlns:w14="http://schemas.microsoft.com/office/word/2010/wordml" xmlns:w15="http://schemas.microsoft.com/office/word/2012/wordml" xmlns:w16cex="http://schemas.microsoft.com/office/word/2018/wordml/cex" xmlns:w16cid="http://schemas.microsoft.com/office/word/2016/wordml/cid" xmlns:w16="http://schemas.microsoft.com/office/word/2018/wordml" xmlns:w16du="http://schemas.microsoft.com/office/word/2023/wordml/word16du" xmlns:w16sdtdh="http://schemas.microsoft.com/office/word/2020/wordml/sdtdatahash" xmlns:w16sdtfl="http://schemas.microsoft.com/office/word/2024/wordml/sdtformatlock" xmlns:w16se="http://schemas.microsoft.com/office/word/2015/wordml/symex" xmlns:wpg="http://schemas.microsoft.com/office/word/2010/wordprocessingGroup" xmlns:wpi="http://schemas.microsoft.com/office/word/2010/wordprocessingInk" xmlns:wne="http://schemas.microsoft.com/office/word/2006/wordml" xmlns:wps="http://schemas.microsoft.com/office/word/2010/wordprocessingShape" mc:Ignorable="w14 w15 w16se w16cid w16 w16cex w16sdtdh w16sdtfl w16du wp14">
+<w:numbering xmlns:wpc="http://schemas.microsoft.com/office/word/2010/wordprocessingCanvas" xmlns:cx="http://schemas.microsoft.com/office/drawing/2014/chartex" xmlns:cx1="http://schemas.microsoft.com/office/drawing/2015/9/8/chartex" xmlns:cx2="http://schemas.microsoft.com/office/drawing/2015/10/21/chartex" xmlns:cx3="http://schemas.microsoft.com/office/drawing/2016/5/9/chartex" xmlns:cx4="http://schemas.microsoft.com/office/drawing/2016/5/10/chartex" xmlns:cx5="http://schemas.microsoft.com/office/drawing/2016/5/11/chartex" xmlns:cx6="http://schemas.microsoft.com/office/drawing/2016/5/12/chartex" xmlns:cx7="http://schemas.microsoft.com/office/drawing/2016/5/13/chartex" xmlns:cx8="http://schemas.microsoft.com/office/drawing/2016/5/14/chartex" xmlns:mc="http://schemas.openxmlformats.org/markup-compatibility/2006" xmlns:m="http://schemas.openxmlformats.org/officeDocument/2006/math" xmlns:aink="http://schemas.microsoft.com/office/drawing/2016/ink" xmlns:am3d="http://schemas.microsoft.com/office/drawing/2017/model3d" xmlns:oel="http://schemas.microsoft.com/office/2019/extlst" xmlns:r="http://schemas.openxmlformats.org/officeDocument/2006/relationships" xmlns:wp14="http://schemas.microsoft.com/office/word/2010/wordprocessingDrawing" xmlns:wp="http://schemas.openxmlformats.org/drawingml/2006/wordprocessingDrawing" xmlns:wpg="http://schemas.microsoft.com/office/word/2010/wordprocessingGroup" xmlns:wpi="http://schemas.microsoft.com/office/word/2010/wordprocessingInk" xmlns:wps="http://schemas.microsoft.com/office/word/2010/wordprocessingShape" xmlns:o="urn:schemas-microsoft-com:office:office" xmlns:v="urn:schemas-microsoft-com:vml" xmlns:w10="urn:schemas-microsoft-com:office:word" xmlns:w="http://schemas.openxmlformats.org/wordprocessingml/2006/main" xmlns:w14="http://schemas.microsoft.com/office/word/2010/wordml" xmlns:w15="http://schemas.microsoft.com/office/word/2012/wordml" xmlns:w16cei="http://schemas.microsoft.com/office/word/2026/wordml/cei" xmlns:w16cex="http://schemas.microsoft.com/office/word/2018/wordml/cex" xmlns:w16cid="http://schemas.microsoft.com/office/word/2016/wordml/cid" xmlns:w16="http://schemas.microsoft.com/office/word/2018/wordml" xmlns:w16sdtdh="http://schemas.microsoft.com/office/word/2020/wordml/sdtdatahash" xmlns:w16sdtfl="http://schemas.microsoft.com/office/word/2024/wordml/sdtformatlock" xmlns:w16se="http://schemas.microsoft.com/office/word/2015/wordml/symex" xmlns:w16du="http://schemas.microsoft.com/office/word/2023/wordml/word16du" xmlns:wne="http://schemas.microsoft.com/office/word/2006/wordml" mc:Ignorable="w14 w15 w16se w16cid w16 w16cex w16sdtdh w16sdtfl w16du wp14">
   <w:abstractNum w:abstractNumId="0" w15:restartNumberingAfterBreak="0">
     <w:nsid w:val="26FB18A2"/>
     <w:multiLevelType w:val="hybridMultilevel"/>
@@ -3294,7 +3463,7 @@
 </file>
 
 <file path=word/styles.xml><?xml version="1.0" encoding="utf-8"?>
-<w:styles xmlns:mc="http://schemas.openxmlformats.org/markup-compatibility/2006" xmlns:r="http://schemas.openxmlformats.org/officeDocument/2006/relationships" xmlns:w="http://schemas.openxmlformats.org/wordprocessingml/2006/main" xmlns:w14="http://schemas.microsoft.com/office/word/2010/wordml" xmlns:w15="http://schemas.microsoft.com/office/word/2012/wordml" xmlns:w16cex="http://schemas.microsoft.com/office/word/2018/wordml/cex" xmlns:w16cid="http://schemas.microsoft.com/office/word/2016/wordml/cid" xmlns:w16="http://schemas.microsoft.com/office/word/2018/wordml" xmlns:w16du="http://schemas.microsoft.com/office/word/2023/wordml/word16du" xmlns:w16sdtdh="http://schemas.microsoft.com/office/word/2020/wordml/sdtdatahash" xmlns:w16sdtfl="http://schemas.microsoft.com/office/word/2024/wordml/sdtformatlock" xmlns:w16se="http://schemas.microsoft.com/office/word/2015/wordml/symex" mc:Ignorable="w14 w15 w16se w16cid w16 w16cex w16sdtdh w16sdtfl w16du">
+<w:styles xmlns:mc="http://schemas.openxmlformats.org/markup-compatibility/2006" xmlns:r="http://schemas.openxmlformats.org/officeDocument/2006/relationships" xmlns:w="http://schemas.openxmlformats.org/wordprocessingml/2006/main" xmlns:w14="http://schemas.microsoft.com/office/word/2010/wordml" xmlns:w15="http://schemas.microsoft.com/office/word/2012/wordml" xmlns:w16cex="http://schemas.microsoft.com/office/word/2018/wordml/cex" xmlns:w16cid="http://schemas.microsoft.com/office/word/2016/wordml/cid" xmlns:w16="http://schemas.microsoft.com/office/word/2018/wordml" xmlns:w16sdtdh="http://schemas.microsoft.com/office/word/2020/wordml/sdtdatahash" xmlns:w16sdtfl="http://schemas.microsoft.com/office/word/2024/wordml/sdtformatlock" xmlns:w16se="http://schemas.microsoft.com/office/word/2015/wordml/symex" xmlns:w16du="http://schemas.microsoft.com/office/word/2023/wordml/word16du" mc:Ignorable="w14 w15 w16se w16cid w16 w16cex w16sdtdh w16sdtfl w16du">
   <w:docDefaults>
     <w:rPrDefault>
       <w:rPr>

</xml_diff>